<commit_message>
Add submitter name to cover page
Co-Authored-By: Claude Opus 5.5 <noreply@anthropic.com>
Claude-Session: https://claude.ai/code/session_01QD6xkALbogaTmX2V72X9od
</commit_message>
<xml_diff>
--- a/מטלת_אמצע_היבטים_פסיכולוגיים.docx
+++ b/מטלת_אמצע_היבטים_פסיכולוגיים.docx
@@ -205,20 +205,9 @@
           <w:rFonts w:ascii="David" w:cs="David" w:eastAsia="David" w:hAnsi="David" w:hint="cs"/>
           <w:sz w:val="24"/>
           <w:szCs w:val="24"/>
-          <w:highlight w:val="yellow"/>
-          <w:highlightCs w:val="yellow"/>
-          <w:rtl/>
-        </w:rPr>
-        <w:t xml:space="preserve">[שם מלא]</w:t>
-      </w:r>
-      <w:r>
-        <w:rPr>
-          <w:rFonts w:ascii="David" w:cs="David" w:eastAsia="David" w:hAnsi="David" w:hint="cs"/>
-          <w:sz w:val="24"/>
-          <w:szCs w:val="24"/>
-          <w:rtl/>
-        </w:rPr>
-        <w:t xml:space="preserve">, ת"ז </w:t>
+          <w:rtl/>
+        </w:rPr>
+        <w:t xml:space="preserve">יסמין טהא, ת"ז </w:t>
       </w:r>
       <w:r>
         <w:rPr>

</xml_diff>

<commit_message>
Write full mid-term paper analyzing the Nir Oz article
Co-Authored-By: Claude Opus 5.5 <noreply@anthropic.com>
Claude-Session: https://claude.ai/code/session_01QD6xkALbogaTmX2V72X9od
</commit_message>
<xml_diff>
--- a/מטלת_אמצע_היבטים_פסיכולוגיים.docx
+++ b/מטלת_אמצע_היבטים_פסיכולוגיים.docx
@@ -163,7 +163,7 @@
     <w:p>
       <w:pPr>
         <w:bidi/>
-        <w:spacing w:after="1000" w:line="360"/>
+        <w:spacing w:after="0" w:line="360"/>
         <w:jc w:val="center"/>
       </w:pPr>
       <w:r>
@@ -171,44 +171,76 @@
           <w:rFonts w:ascii="David" w:cs="David" w:eastAsia="David" w:hAnsi="David" w:hint="cs"/>
           <w:sz w:val="28"/>
           <w:szCs w:val="28"/>
+          <w:rtl/>
+        </w:rPr>
+        <w:t xml:space="preserve">הבית שאי אפשר לחזור אליו:</w:t>
+      </w:r>
+    </w:p>
+    <w:p>
+      <w:pPr>
+        <w:bidi/>
+        <w:spacing w:after="1000" w:line="360"/>
+        <w:jc w:val="center"/>
+      </w:pPr>
+      <w:r>
+        <w:rPr>
+          <w:rFonts w:ascii="David" w:cs="David" w:eastAsia="David" w:hAnsi="David" w:hint="cs"/>
+          <w:sz w:val="28"/>
+          <w:szCs w:val="28"/>
+          <w:rtl/>
+        </w:rPr>
+        <w:t xml:space="preserve">טראומה, אובדן והכרה חברתית בקרב תושבי ניר עוז</w:t>
+      </w:r>
+    </w:p>
+    <w:p>
+      <w:pPr>
+        <w:bidi/>
+        <w:spacing w:after="120" w:line="360"/>
+        <w:jc w:val="center"/>
+      </w:pPr>
+      <w:r>
+        <w:rPr>
+          <w:rFonts w:ascii="David" w:cs="David" w:eastAsia="David" w:hAnsi="David" w:hint="cs"/>
+          <w:sz w:val="24"/>
+          <w:szCs w:val="24"/>
+          <w:rtl/>
+        </w:rPr>
+        <w:t xml:space="preserve">מגישות:</w:t>
+      </w:r>
+    </w:p>
+    <w:p>
+      <w:pPr>
+        <w:bidi/>
+        <w:spacing w:after="120" w:line="360"/>
+        <w:jc w:val="center"/>
+      </w:pPr>
+      <w:r>
+        <w:rPr>
+          <w:rFonts w:ascii="David" w:cs="David" w:eastAsia="David" w:hAnsi="David" w:hint="cs"/>
+          <w:sz w:val="24"/>
+          <w:szCs w:val="24"/>
+          <w:rtl/>
+        </w:rPr>
+        <w:t xml:space="preserve">יסמין טהא, ת"ז </w:t>
+      </w:r>
+      <w:r>
+        <w:rPr>
+          <w:rFonts w:ascii="David" w:cs="David" w:eastAsia="David" w:hAnsi="David" w:hint="cs"/>
+          <w:sz w:val="24"/>
+          <w:szCs w:val="24"/>
           <w:highlight w:val="yellow"/>
           <w:highlightCs w:val="yellow"/>
           <w:rtl/>
         </w:rPr>
-        <w:t xml:space="preserve">[כותרת העבודה]</w:t>
-      </w:r>
-    </w:p>
-    <w:p>
-      <w:pPr>
-        <w:bidi/>
-        <w:spacing w:after="120" w:line="360"/>
-        <w:jc w:val="center"/>
-      </w:pPr>
-      <w:r>
-        <w:rPr>
-          <w:rFonts w:ascii="David" w:cs="David" w:eastAsia="David" w:hAnsi="David" w:hint="cs"/>
-          <w:sz w:val="24"/>
-          <w:szCs w:val="24"/>
-          <w:rtl/>
-        </w:rPr>
-        <w:t xml:space="preserve">מגישות:</w:t>
-      </w:r>
-    </w:p>
-    <w:p>
-      <w:pPr>
-        <w:bidi/>
-        <w:spacing w:after="120" w:line="360"/>
-        <w:jc w:val="center"/>
-      </w:pPr>
-      <w:r>
-        <w:rPr>
-          <w:rFonts w:ascii="David" w:cs="David" w:eastAsia="David" w:hAnsi="David" w:hint="cs"/>
-          <w:sz w:val="24"/>
-          <w:szCs w:val="24"/>
-          <w:rtl/>
-        </w:rPr>
-        <w:t xml:space="preserve">יסמין טהא, ת"ז </w:t>
-      </w:r>
+        <w:t xml:space="preserve">[מספר]</w:t>
+      </w:r>
+    </w:p>
+    <w:p>
+      <w:pPr>
+        <w:bidi/>
+        <w:spacing w:after="600" w:line="360"/>
+        <w:jc w:val="center"/>
+      </w:pPr>
       <w:r>
         <w:rPr>
           <w:rFonts w:ascii="David" w:cs="David" w:eastAsia="David" w:hAnsi="David" w:hint="cs"/>
@@ -218,15 +250,17 @@
           <w:highlightCs w:val="yellow"/>
           <w:rtl/>
         </w:rPr>
-        <w:t xml:space="preserve">[מספר]</w:t>
-      </w:r>
-    </w:p>
-    <w:p>
-      <w:pPr>
-        <w:bidi/>
-        <w:spacing w:after="600" w:line="360"/>
-        <w:jc w:val="center"/>
-      </w:pPr>
+        <w:t xml:space="preserve">[שם מלא]</w:t>
+      </w:r>
+      <w:r>
+        <w:rPr>
+          <w:rFonts w:ascii="David" w:cs="David" w:eastAsia="David" w:hAnsi="David" w:hint="cs"/>
+          <w:sz w:val="24"/>
+          <w:szCs w:val="24"/>
+          <w:rtl/>
+        </w:rPr>
+        <w:t xml:space="preserve">, ת"ז </w:t>
+      </w:r>
       <w:r>
         <w:rPr>
           <w:rFonts w:ascii="David" w:cs="David" w:eastAsia="David" w:hAnsi="David" w:hint="cs"/>
@@ -236,26 +270,6 @@
           <w:highlightCs w:val="yellow"/>
           <w:rtl/>
         </w:rPr>
-        <w:t xml:space="preserve">[שם מלא]</w:t>
-      </w:r>
-      <w:r>
-        <w:rPr>
-          <w:rFonts w:ascii="David" w:cs="David" w:eastAsia="David" w:hAnsi="David" w:hint="cs"/>
-          <w:sz w:val="24"/>
-          <w:szCs w:val="24"/>
-          <w:rtl/>
-        </w:rPr>
-        <w:t xml:space="preserve">, ת"ז </w:t>
-      </w:r>
-      <w:r>
-        <w:rPr>
-          <w:rFonts w:ascii="David" w:cs="David" w:eastAsia="David" w:hAnsi="David" w:hint="cs"/>
-          <w:sz w:val="24"/>
-          <w:szCs w:val="24"/>
-          <w:highlight w:val="yellow"/>
-          <w:highlightCs w:val="yellow"/>
-          <w:rtl/>
-        </w:rPr>
         <w:t xml:space="preserve">[מספר]</w:t>
       </w:r>
     </w:p>
@@ -270,31 +284,9 @@
           <w:rFonts w:ascii="David" w:cs="David" w:eastAsia="David" w:hAnsi="David" w:hint="cs"/>
           <w:sz w:val="24"/>
           <w:szCs w:val="24"/>
-          <w:highlight w:val="yellow"/>
-          <w:highlightCs w:val="yellow"/>
-          <w:rtl/>
-        </w:rPr>
-        <w:t xml:space="preserve">[תאריך עברי]</w:t>
-      </w:r>
-      <w:r>
-        <w:rPr>
-          <w:rFonts w:ascii="David" w:cs="David" w:eastAsia="David" w:hAnsi="David" w:hint="cs"/>
-          <w:sz w:val="24"/>
-          <w:szCs w:val="24"/>
-          <w:rtl/>
-        </w:rPr>
-        <w:t xml:space="preserve"> | </w:t>
-      </w:r>
-      <w:r>
-        <w:rPr>
-          <w:rFonts w:ascii="David" w:cs="David" w:eastAsia="David" w:hAnsi="David" w:hint="cs"/>
-          <w:sz w:val="24"/>
-          <w:szCs w:val="24"/>
-          <w:highlight w:val="yellow"/>
-          <w:highlightCs w:val="yellow"/>
-          <w:rtl/>
-        </w:rPr>
-        <w:t xml:space="preserve">[תאריך לועזי]</w:t>
+          <w:rtl/>
+        </w:rPr>
+        <w:t xml:space="preserve">ט"ו בתשרי תשפ"ז | 26 בספטמבר 2026</w:t>
       </w:r>
     </w:p>
     <w:p>
@@ -333,11 +325,26 @@
           <w:rFonts w:ascii="David" w:cs="David" w:eastAsia="David" w:hAnsi="David" w:hint="cs"/>
           <w:sz w:val="24"/>
           <w:szCs w:val="24"/>
-          <w:highlight w:val="yellow"/>
-          <w:highlightCs w:val="yellow"/>
-          <w:rtl/>
-        </w:rPr>
-        <w:t xml:space="preserve">[פסקה אחת עד שתיים: מה אירע, באיזה הקשר, מי הדמויות המעורבות (בלי פרטים מזהים) ומדוע החוויה משמעותית. באופציה 2 יש לצרף כאן קישור לכתבה או צילום מסך. לכתוב בגוף שלישי, למשל "המקרה עוסק באישה בשנות הארבעים לחייה" ולא "אמא שלי".]</w:t>
+          <w:rtl/>
+        </w:rPr>
+        <w:t xml:space="preserve">כמעט שנתיים וחצי אחרי טבח 7 באוקטובר, חלק מתושבי קיבוץ ניר עוז עדיין אינם מסוגלים לחזור לבתיהם. במרץ 2026 הגיעו כמה מהם לדיון בוועדת הנגב והגליל בכנסת כדי לדרוש פתרון מסודר (גרין שאולוב, 2026). בין הדוברים היו חבר קיבוץ ששרד את הטבח עם אשתו וילדיו, אם שבנה נפל בקרב על הקיבוץ וגופתו נחטפה לרצועה, ושורדת שבי ששוחררה עם שתי בנותיה אחרי 52 ימים ובעלה נרצח. כבר בנובמבר 2024 הובטחה להם ועדת חריגים שתטפל במי שאינם יכולים לחזור, אך הוועדה לא הוקמה.</w:t>
+      </w:r>
+    </w:p>
+    <w:p>
+      <w:pPr>
+        <w:bidi/>
+        <w:spacing w:after="120" w:line="360"/>
+        <w:ind w:firstLine="0"/>
+        <w:jc w:val="both"/>
+      </w:pPr>
+      <w:r>
+        <w:rPr>
+          <w:rFonts w:ascii="David" w:cs="David" w:eastAsia="David" w:hAnsi="David" w:hint="cs"/>
+          <w:sz w:val="24"/>
+          <w:szCs w:val="24"/>
+          <w:rtl/>
+        </w:rPr>
+        <w:t xml:space="preserve">המקרה משמעותי משום שהאובדן בו כפול. התושבים איבדו בני משפחה, בית, קהילה וביטחון כלכלי, ובנוסף הם חווים שהמדינה אינה רואה אותם. הכתבה: https://www.ynet.co.il/news/article/skwewngibl</w:t>
       </w:r>
     </w:p>
     <w:p>
@@ -361,6 +368,25 @@
     </w:p>
     <w:p>
       <w:pPr>
+        <w:pStyle w:val="Heading2"/>
+        <w:bidi/>
+        <w:spacing w:after="120" w:before="240" w:line="360"/>
+        <w:jc w:val="right"/>
+      </w:pPr>
+      <w:r>
+        <w:rPr>
+          <w:rFonts w:ascii="David" w:cs="David" w:eastAsia="David" w:hAnsi="David" w:hint="cs"/>
+          <w:b/>
+          <w:bCs/>
+          <w:sz w:val="24"/>
+          <w:szCs w:val="24"/>
+          <w:rtl/>
+        </w:rPr>
+        <w:t xml:space="preserve">1. הרמן: טראומה כתופעה חברתית</w:t>
+      </w:r>
+    </w:p>
+    <w:p>
+      <w:pPr>
         <w:bidi/>
         <w:spacing w:after="120" w:line="360"/>
         <w:ind w:firstLine="0"/>
@@ -373,7 +399,24 @@
           <w:szCs w:val="24"/>
           <w:rtl/>
         </w:rPr>
-        <w:t xml:space="preserve">הניתוח נשען על שלוש מסגרות שנלמדו בקורס: מודל ההחלמה של הרמן, ההיבט הגופני של הטראומה כפי שתיאר אותו ואן דר קולק, ושלבי האבל של קובלר-רוס.</w:t>
+        <w:t xml:space="preserve">הרמן (1992/2001) רואה בטראומה תופעה חברתית ולא רק חוויה פרטית. האירוע מנפץ את תחושת הביטחון, האמון והאוטונומיה, וכשהסביבה אינה מכירה בפגיעה נוצרת פגיעה נוספת, שנלווים אליה בדידות ותחושת נטישה. ההחלמה מתחילה ביצירת ביטחון ושליטה, עוברת בזכירה ואבלות ובקשר מחודש עם אחרים, ומסתיימת בצדק שעניינו תיקון הנזק ולא ענישה (זמיר נצראל, 2026ג).</w:t>
+      </w:r>
+    </w:p>
+    <w:p>
+      <w:pPr>
+        <w:bidi/>
+        <w:spacing w:after="120" w:line="360"/>
+        <w:ind w:firstLine="0"/>
+        <w:jc w:val="both"/>
+      </w:pPr>
+      <w:r>
+        <w:rPr>
+          <w:rFonts w:ascii="David" w:cs="David" w:eastAsia="David" w:hAnsi="David" w:hint="cs"/>
+          <w:sz w:val="24"/>
+          <w:szCs w:val="24"/>
+          <w:rtl/>
+        </w:rPr>
+        <w:t xml:space="preserve">דברי התושבים מתארים כמעט אחד לאחד את מה שהרמן מכנה פגיעה משנית. האם השכולה אמרה ש"אף אחד לא שאל אותנו עם מה אנחנו מתמודדים", וחבר הקיבוץ השווה בין ה"יחס האישי" שקיבל מחמאס ובין היחס שהוא מצפה לו מהממשלה (גרין שאולוב, 2026). במונחי המודל, התושבים תקועים בשלב הראשון: בלי בית ובלי ביטחון כלכלי אין בסיס בטוח שממנו אפשר להתחיל לעבד. הדרישה שלהם "לייצג את עצמנו" היא ניסיון להחזיר לעצמם שליטה, והדרישה לפתרון בדומה למפוני גוש קטיף היא בקשה לצדק במובן של תיקון.</w:t>
       </w:r>
     </w:p>
     <w:p>
@@ -392,7 +435,7 @@
           <w:szCs w:val="24"/>
           <w:rtl/>
         </w:rPr>
-        <w:t xml:space="preserve">1. הרמן: טראומה כתופעה חברתית ומודל ההחלמה</w:t>
+        <w:t xml:space="preserve">2. ואן דר קולק: הטראומה היא התגובה, לא האירוע</w:t>
       </w:r>
     </w:p>
     <w:p>
@@ -409,7 +452,7 @@
           <w:szCs w:val="24"/>
           <w:rtl/>
         </w:rPr>
-        <w:t xml:space="preserve">הרמן (1992/2001) רואה בטראומה תופעה חברתית ולא רק חוויה פרטית. האירוע הטראומטי עלול לנפץ את תחושת הביטחון, האמון והאוטונומיה, ולהשאיר את האדם עם חוסר אונים ואובדן שליטה. תגובות כמו קהות רגשית, ערנות יתר ודיסוציאציה אינן סימן לחולשה. אלו תגובות נורמליות לנסיבות חריגות. כשהסביבה אינה מכירה בפגיעה, מפקפקת בנפגע או מאשימה אותו, נוצרת פגיעה נוספת שחוסמת את הדרך להחלמה.</w:t>
+        <w:t xml:space="preserve">לפי ואן דר קולק (2014/2021), הטראומה אינה האירוע עצמו אלא האופן שבו האדם חווה אותו ומפרש אותו. הפרשנות מושפעת מהאישיות, מניסיון קודם ומיסודות הביטחון, והגוף ממשיך לאותת על סכנה גם אחרי שהאירוע הסתיים. אחד הביטויים של פוסט טראומה הוא הימנעות (זמיר נצראל, 2026ב).</w:t>
       </w:r>
     </w:p>
     <w:p>
@@ -426,7 +469,26 @@
           <w:szCs w:val="24"/>
           <w:rtl/>
         </w:rPr>
-        <w:t xml:space="preserve">מודל ההחלמה, כפי שהוצג בקורס, מתקדם בארבעה שלבים: יצירת ביטחון ושליטה, זכירה ואבלות, ביסוס קשר מחודש עם אחרים, ולבסוף צדק, שעניינו תיקון הנזק ולא ענישת הפוגע. המדד הטוב ביותר להחלמה הוא היכולת לחזור וליהנות מהחיים ולהיות מעורב באופן מלא ביחסים עם אחרים (זמיר נצראל, 2026ג).</w:t>
+        <w:t xml:space="preserve">ההבדל בין התושבים שחזרו ובין אלה שלא הצליחו לחזור ממחיש את הטענה. זה אותו קיבוץ ואותו אירוע, אבל "אני לא מסוגל לחזור אחרי מה שעברתי" מתאר תגובה אישית, לא החלטה רציונלית. גם שורדת השבי אינה אומרת שהקיבוץ מסוכן. היא אומרת "אני לא יכולה לחזור לשם לבד" (גרין שאולוב, 2026). ההימנעות מהמקום עצמו היא הדרך שבה הגוף שומר על האדם.</w:t>
+      </w:r>
+    </w:p>
+    <w:p>
+      <w:pPr>
+        <w:pStyle w:val="Heading2"/>
+        <w:bidi/>
+        <w:spacing w:after="120" w:before="240" w:line="360"/>
+        <w:jc w:val="right"/>
+      </w:pPr>
+      <w:r>
+        <w:rPr>
+          <w:rFonts w:ascii="David" w:cs="David" w:eastAsia="David" w:hAnsi="David" w:hint="cs"/>
+          <w:b/>
+          <w:bCs/>
+          <w:sz w:val="24"/>
+          <w:szCs w:val="24"/>
+          <w:rtl/>
+        </w:rPr>
+        <w:t xml:space="preserve">3. קובלר-רוס: אבל על בית ועל עתיד</w:t>
       </w:r>
     </w:p>
     <w:p>
@@ -441,11 +503,9 @@
           <w:rFonts w:ascii="David" w:cs="David" w:eastAsia="David" w:hAnsi="David" w:hint="cs"/>
           <w:sz w:val="24"/>
           <w:szCs w:val="24"/>
-          <w:highlight w:val="yellow"/>
-          <w:highlightCs w:val="yellow"/>
-          <w:rtl/>
-        </w:rPr>
-        <w:t xml:space="preserve">[קישור למקרה: באיזה שלב נמצאת הדמות? האם הסביבה הכירה בפגיעה או התעלמה ממנה? דוגמה קונקרטית אחת מהמקרה.]</w:t>
+          <w:rtl/>
+        </w:rPr>
+        <w:t xml:space="preserve">קובלר-רוס (2002) תיארה חמישה שלבים בהתמודדות עם אובדן: הכחשה, כעס, מיקוח, דיכאון והשלמה. הסדר והעוצמה משתנים מאדם לאדם, ואובדן יכול להיות גם של בית, שגרה או תחושת ביטחון (זמיר נצראל, 2026א). הכעס בולט בכתבה ומופנה כלפי המדינה: "מינהלת התקומה מתעסקת בבטון ולא בשיקום התושבים". האובדן גם אינו רק של העבר. האם מתארת ילדים שהם דור שלישי בקיבוץ, שבתיהם נהרסו ובמקומם נבנים בתים שהם לא יגורו בהם (גרין שאולוב, 2026). השאלה של שורדת השבי, "איך אני בונה בית מחדש?", כבר מביטה קדימה ונוגעת בהשלמה, אבל בלי תשובה מעשית קשה להגיע אליה.</w:t>
       </w:r>
     </w:p>
     <w:p>
@@ -464,7 +524,7 @@
           <w:szCs w:val="24"/>
           <w:rtl/>
         </w:rPr>
-        <w:t xml:space="preserve">2. ואן דר קולק: הגוף זוכר</w:t>
+        <w:t xml:space="preserve">ההקשר התרבותי והחברתי</w:t>
       </w:r>
     </w:p>
     <w:p>
@@ -481,7 +541,26 @@
           <w:szCs w:val="24"/>
           <w:rtl/>
         </w:rPr>
-        <w:t xml:space="preserve">לפי ואן דר קולק (2014/2021), הטראומה אינה האירוע עצמו אלא האופן שבו האדם חווה אותו ומפרש אותו. לכן אותו אירוע יכול להשאיר אדם אחד פגוע ואדם אחר כמעט בלי פגע, בהתאם לאישיות, לניסיון קודם וליסודות הביטחון שלו. הטענה המרכזית בספרו היא שגם אחרי שהאירוע הסתיים, הגוף ממשיך לחוות אותו. הורמוני הדחק מועילים בטווח הקצר ומזיקים בטווח הארוך, והמוח הקדום ממשיך לאותת על סכנה. התוצאה יכולה להיות כאב כרוני, בעיות עיכול ופגיעה במערכת החיסון. מכאן גם הטיפול שהוא מציע: עבודה "מלמטה למעלה" שמחזירה מגע עם הגוף, כמו יוגה, מיינדפולנס ו-EMDR (זמיר נצראל, 2026ב).</w:t>
+        <w:t xml:space="preserve">הקיבוץ הוא לא רק מקום מגורים אלא זהות קהילתית, ופגיעה בו היא אובדן של עולם ההנחות: ההנחה שאנחנו, כאנשים וכחברה, מוגנים (זמיר נצראל, 2026ב). טראומה קולקטיבית נצרבת בזיכרון הקבוצה (Saul, 2014, כפי שמצוטט אצל זמיר נצראל, 2026ג), וכמעט תמיד הופכת לבין-דורית (Hirschberger, 2018, כפי שמצוטט אצל זמיר נצראל, 2026ג). הנרטיב הציבורי של "חוזרים ובונים" מקשה במיוחד על מי שאינו מסוגל לחזור, וזו אולי הסיבה שחלק מהתושבים דורשים לדבר בשם עצמם ולא דרך הקיבוץ או המועצה.</w:t>
+      </w:r>
+    </w:p>
+    <w:p>
+      <w:pPr>
+        <w:pStyle w:val="Heading2"/>
+        <w:bidi/>
+        <w:spacing w:after="120" w:before="240" w:line="360"/>
+        <w:jc w:val="right"/>
+      </w:pPr>
+      <w:r>
+        <w:rPr>
+          <w:rFonts w:ascii="David" w:cs="David" w:eastAsia="David" w:hAnsi="David" w:hint="cs"/>
+          <w:b/>
+          <w:bCs/>
+          <w:sz w:val="24"/>
+          <w:szCs w:val="24"/>
+          <w:rtl/>
+        </w:rPr>
+        <w:t xml:space="preserve">מה התאוריות מסבירות היטב, ומה פחות</w:t>
       </w:r>
     </w:p>
     <w:p>
@@ -496,176 +575,9 @@
           <w:rFonts w:ascii="David" w:cs="David" w:eastAsia="David" w:hAnsi="David" w:hint="cs"/>
           <w:sz w:val="24"/>
           <w:szCs w:val="24"/>
-          <w:highlight w:val="yellow"/>
-          <w:highlightCs w:val="yellow"/>
-          <w:rtl/>
-        </w:rPr>
-        <w:t xml:space="preserve">[קישור למקרה: אילו תגובות גופניות הופיעו (שינה, דריכות, כאבים, הימנעות ממקומות)? האם נעשה שימוש באחת מדרכי ההתמודדות האלה?]</w:t>
-      </w:r>
-    </w:p>
-    <w:p>
-      <w:pPr>
-        <w:pStyle w:val="Heading2"/>
-        <w:bidi/>
-        <w:spacing w:after="120" w:before="240" w:line="360"/>
-        <w:jc w:val="right"/>
-      </w:pPr>
-      <w:r>
-        <w:rPr>
-          <w:rFonts w:ascii="David" w:cs="David" w:eastAsia="David" w:hAnsi="David" w:hint="cs"/>
-          <w:b/>
-          <w:bCs/>
-          <w:sz w:val="24"/>
-          <w:szCs w:val="24"/>
-          <w:rtl/>
-        </w:rPr>
-        <w:t xml:space="preserve">3. קובלר-רוס: חמשת שלבי האבל</w:t>
-      </w:r>
-    </w:p>
-    <w:p>
-      <w:pPr>
-        <w:bidi/>
-        <w:spacing w:after="120" w:line="360"/>
-        <w:ind w:firstLine="0"/>
-        <w:jc w:val="both"/>
-      </w:pPr>
-      <w:r>
-        <w:rPr>
-          <w:rFonts w:ascii="David" w:cs="David" w:eastAsia="David" w:hAnsi="David" w:hint="cs"/>
-          <w:sz w:val="24"/>
-          <w:szCs w:val="24"/>
-          <w:rtl/>
-        </w:rPr>
-        <w:t xml:space="preserve">קובלר-רוס (2002) תיארה חמישה שלבים בהתמודדות עם אובדן: הכחשה ובידוד, כעס, מיקוח, דיכאון והשלמה. ההכחשה פועלת כבולם זעזועים שמאפשר לאסוף כוחות. הכעס מופנה לא פעם כלפי הסביבה, שמתקשה להכיל אותו. במיקוח האדם מנסה לדחות את הקץ ולהרוויח זמן, והדיכאון, עם רגשות האשם ותחושת ההחמצה, הוא שלב הכרחי בדרך להשלמה. הסדר, העוצמה ומשך כל שלב משתנים מאדם לאדם (זמיר נצראל, 2026א). אובדן אינו רק מוות. גם בית, שגרה, מערכת יחסים או תחושת ביטחון יכולים להיות מושא לאבל.</w:t>
-      </w:r>
-    </w:p>
-    <w:p>
-      <w:pPr>
-        <w:bidi/>
-        <w:spacing w:after="120" w:line="360"/>
-        <w:ind w:firstLine="0"/>
-        <w:jc w:val="both"/>
-      </w:pPr>
-      <w:r>
-        <w:rPr>
-          <w:rFonts w:ascii="David" w:cs="David" w:eastAsia="David" w:hAnsi="David" w:hint="cs"/>
-          <w:sz w:val="24"/>
-          <w:szCs w:val="24"/>
-          <w:highlight w:val="yellow"/>
-          <w:highlightCs w:val="yellow"/>
-          <w:rtl/>
-        </w:rPr>
-        <w:t xml:space="preserve">[קישור למקרה: אילו שלבים ניכרים? ציטוט קצר או התנהגות שממחישים שלב אחד לפחות.]</w:t>
-      </w:r>
-    </w:p>
-    <w:p>
-      <w:pPr>
-        <w:pStyle w:val="Heading2"/>
-        <w:bidi/>
-        <w:spacing w:after="120" w:before="240" w:line="360"/>
-        <w:jc w:val="right"/>
-      </w:pPr>
-      <w:r>
-        <w:rPr>
-          <w:rFonts w:ascii="David" w:cs="David" w:eastAsia="David" w:hAnsi="David" w:hint="cs"/>
-          <w:b/>
-          <w:bCs/>
-          <w:sz w:val="24"/>
-          <w:szCs w:val="24"/>
-          <w:rtl/>
-        </w:rPr>
-        <w:t xml:space="preserve">ההקשר התרבותי והחברתי</w:t>
-      </w:r>
-    </w:p>
-    <w:p>
-      <w:pPr>
-        <w:bidi/>
-        <w:spacing w:after="120" w:line="360"/>
-        <w:ind w:firstLine="0"/>
-        <w:jc w:val="both"/>
-      </w:pPr>
-      <w:r>
-        <w:rPr>
-          <w:rFonts w:ascii="David" w:cs="David" w:eastAsia="David" w:hAnsi="David" w:hint="cs"/>
-          <w:sz w:val="24"/>
-          <w:szCs w:val="24"/>
-          <w:rtl/>
-        </w:rPr>
-        <w:t xml:space="preserve">חוויה אישית בישראל של התקופה הנוכחית מתרחשת בתוך טראומה קולקטיבית, כזו שפוגעת בקהילה ובחברה כולה ולא רק ביחיד. אחד מביטוייה הוא אובדן עולם ההנחות: ההנחה שהמעשים שלנו משפיעים על התוצאות ושאנחנו, כאנשים וכחברה, מוגנים (זמיר נצראל, 2026ב). אירועים כאלה נצרבים בזיכרון הקולקטיבי ומעצבים נרטיבים תרבותיים (Saul, 2014, כפי שמצוטט אצל זמיר נצראל, 2026ג), וכמעט כל טראומה קולקטיבית הופכת עם הזמן לבין-דורית (Hirschberger, 2018, כפי שמצוטט אצל זמיר נצראל, 2026ג). בקורס הודגם כיצד אירועי 7 באוקטובר עוררו מחדש את זיכרון השואה אצל יהודים בישראל, והמלחמה בעזה עוררה את זיכרון הנכבה אצל פלסטינים.</w:t>
-      </w:r>
-    </w:p>
-    <w:p>
-      <w:pPr>
-        <w:bidi/>
-        <w:spacing w:after="120" w:line="360"/>
-        <w:ind w:firstLine="0"/>
-        <w:jc w:val="both"/>
-      </w:pPr>
-      <w:r>
-        <w:rPr>
-          <w:rFonts w:ascii="David" w:cs="David" w:eastAsia="David" w:hAnsi="David" w:hint="cs"/>
-          <w:sz w:val="24"/>
-          <w:szCs w:val="24"/>
-          <w:highlight w:val="yellow"/>
-          <w:highlightCs w:val="yellow"/>
-          <w:rtl/>
-        </w:rPr>
-        <w:t xml:space="preserve">[קישור למקרה: כיצד הרקע התרבותי, הדתי או הקהילתי של הדמות עיצב את החוויה? האם הקהילה סייעה או הקשתה?]</w:t>
-      </w:r>
-    </w:p>
-    <w:p>
-      <w:pPr>
-        <w:pStyle w:val="Heading2"/>
-        <w:bidi/>
-        <w:spacing w:after="120" w:before="240" w:line="360"/>
-        <w:jc w:val="right"/>
-      </w:pPr>
-      <w:r>
-        <w:rPr>
-          <w:rFonts w:ascii="David" w:cs="David" w:eastAsia="David" w:hAnsi="David" w:hint="cs"/>
-          <w:b/>
-          <w:bCs/>
-          <w:sz w:val="24"/>
-          <w:szCs w:val="24"/>
-          <w:rtl/>
-        </w:rPr>
-        <w:t xml:space="preserve">מה התאוריות מסבירות היטב, ומה פחות</w:t>
-      </w:r>
-    </w:p>
-    <w:p>
-      <w:pPr>
-        <w:bidi/>
-        <w:spacing w:after="120" w:line="360"/>
-        <w:ind w:firstLine="0"/>
-        <w:jc w:val="both"/>
-      </w:pPr>
-      <w:r>
-        <w:rPr>
-          <w:rFonts w:ascii="David" w:cs="David" w:eastAsia="David" w:hAnsi="David" w:hint="cs"/>
-          <w:sz w:val="24"/>
-          <w:szCs w:val="24"/>
-          <w:rtl/>
-        </w:rPr>
-        <w:t xml:space="preserve">מודל השלבים של קובלר-רוס נוח לתיאור, אבל נוטה להיקרא כרצף ליניארי, ובפועל אנשים חוזרים לשלבים שכבר עברו או חווים כמה מהם בו-זמנית. גם המודל של הרמן מניח שאפשר לבסס קודם כול ביטחון. כשהאיום עצמו נמשך, כמו במלחמה מתמשכת, קשה לדבר על שלב ראשון שהושלם. ההסבר של ואן דר קולק חזק במיוחד בתגובות הגופניות, ופחות מתייחס לממד החברתי שהרמן מדגישה.</w:t>
-      </w:r>
-    </w:p>
-    <w:p>
-      <w:pPr>
-        <w:bidi/>
-        <w:spacing w:after="120" w:line="360"/>
-        <w:ind w:firstLine="0"/>
-        <w:jc w:val="both"/>
-      </w:pPr>
-      <w:r>
-        <w:rPr>
-          <w:rFonts w:ascii="David" w:cs="David" w:eastAsia="David" w:hAnsi="David" w:hint="cs"/>
-          <w:sz w:val="24"/>
-          <w:szCs w:val="24"/>
-          <w:highlight w:val="yellow"/>
-          <w:highlightCs w:val="yellow"/>
-          <w:rtl/>
-        </w:rPr>
-        <w:t xml:space="preserve">[להתאים למקרה: מה במקרה לא מוסבר על ידי אף אחת מהתאוריות?]</w:t>
+          <w:rtl/>
+        </w:rPr>
+        <w:t xml:space="preserve">הרמן מסבירה היטב את הממד החברתי, ובמיוחד את הנזק שבהיעדר הכרה. עם זאת, המודל שלה מניח שאפשר לבסס קודם כול ביטחון, וכאן הביטחון הכלכלי תלוי בהחלטה של המדינה ולא בתהליך הטיפולי. ואן דר קולק מסביר את ההימנעות, אבל הכתבה אינה מתארת תסמינים גופניים, ולכן החלק הזה נשאר השערה. שלבי קובלר-רוס נקראים בקלות כרצף ליניארי, ואילו כאן האובדן עדיין נמשך, והכעס מתחדש בכל פעם שהבטחה אינה מתקיימת.</w:t>
       </w:r>
     </w:p>
     <w:p>
@@ -689,6 +601,43 @@
           <w:rtl/>
         </w:rPr>
         <w:t xml:space="preserve">רשימת מקורות</w:t>
+      </w:r>
+    </w:p>
+    <w:p>
+      <w:pPr>
+        <w:bidi/>
+        <w:spacing w:after="0" w:line="480"/>
+        <w:ind w:start="709" w:hanging="709"/>
+        <w:jc w:val="right"/>
+      </w:pPr>
+      <w:r>
+        <w:rPr>
+          <w:rFonts w:ascii="David" w:cs="David" w:eastAsia="David" w:hAnsi="David" w:hint="cs"/>
+          <w:sz w:val="24"/>
+          <w:szCs w:val="24"/>
+          <w:rtl/>
+        </w:rPr>
+        <w:t xml:space="preserve">גרין שאולוב, ר' (2026, 24 במרץ). שנתיים וחצי אחרי הטבח: התושבים שמתקשים לשוב לניר עוז נותרו בלי פתרון. </w:t>
+      </w:r>
+      <w:r>
+        <w:rPr>
+          <w:rFonts w:ascii="David" w:cs="David" w:eastAsia="David" w:hAnsi="David" w:hint="cs"/>
+          <w:i/>
+          <w:iCs/>
+          <w:sz w:val="24"/>
+          <w:szCs w:val="24"/>
+          <w:rtl/>
+        </w:rPr>
+        <w:t xml:space="preserve">ynet</w:t>
+      </w:r>
+      <w:r>
+        <w:rPr>
+          <w:rFonts w:ascii="David" w:cs="David" w:eastAsia="David" w:hAnsi="David" w:hint="cs"/>
+          <w:sz w:val="24"/>
+          <w:szCs w:val="24"/>
+          <w:rtl/>
+        </w:rPr>
+        <w:t xml:space="preserve">. https://www.ynet.co.il/news/article/skwewngibl</w:t>
       </w:r>
     </w:p>
     <w:p>

</xml_diff>

<commit_message>
Polish paper: paragraph locators for quotes, cite theorists in critique
Co-Authored-By: Claude Opus 5.5 <noreply@anthropic.com>
Claude-Session: https://claude.ai/code/session_01QD6xkALbogaTmX2V72X9od
</commit_message>
<xml_diff>
--- a/מטלת_אמצע_היבטים_פסיכולוגיים.docx
+++ b/מטלת_אמצע_היבטים_פסיכולוגיים.docx
@@ -416,7 +416,7 @@
           <w:szCs w:val="24"/>
           <w:rtl/>
         </w:rPr>
-        <w:t xml:space="preserve">דברי התושבים מתארים כמעט אחד לאחד את מה שהרמן מכנה פגיעה משנית. האם השכולה אמרה ש"אף אחד לא שאל אותנו עם מה אנחנו מתמודדים", וחבר הקיבוץ השווה בין ה"יחס האישי" שקיבל מחמאס ובין היחס שהוא מצפה לו מהממשלה (גרין שאולוב, 2026). במונחי המודל, התושבים תקועים בשלב הראשון: בלי בית ובלי ביטחון כלכלי אין בסיס בטוח שממנו אפשר להתחיל לעבד. הדרישה שלהם "לייצג את עצמנו" היא ניסיון להחזיר לעצמם שליטה, והדרישה לפתרון בדומה למפוני גוש קטיף היא בקשה לצדק במובן של תיקון.</w:t>
+        <w:t xml:space="preserve">דברי התושבים מתארים כמעט אחד לאחד את מה שהרמן מכנה טראומה משנית. האם השכולה אמרה ש"אף אחד לא שאל אותנו עם מה אנחנו מתמודדים" (גרין שאולוב, 2026, פס' 4), וחבר הקיבוץ השווה בין ה"יחס האישי" שקיבל מחמאס ובין היחס שהוא מצפה לו מהממשלה (גרין שאולוב, 2026, פס' 1). במונחי המודל, התושבים תקועים בשלב הראשון: בלי בית ובלי ביטחון כלכלי אין בסיס בטוח שממנו אפשר להתחיל לעבד. הדרישה שלהם "לייצג את עצמנו" (גרין שאולוב, 2026, פס' 3) היא ניסיון להחזיר לעצמם שליטה, והדרישה לפתרון בדומה למפוני גוש קטיף היא בקשה לצדק במובן של תיקון.</w:t>
       </w:r>
     </w:p>
     <w:p>
@@ -469,7 +469,7 @@
           <w:szCs w:val="24"/>
           <w:rtl/>
         </w:rPr>
-        <w:t xml:space="preserve">ההבדל בין התושבים שחזרו ובין אלה שלא הצליחו לחזור ממחיש את הטענה. זה אותו קיבוץ ואותו אירוע, אבל "אני לא מסוגל לחזור אחרי מה שעברתי" מתאר תגובה אישית, לא החלטה רציונלית. גם שורדת השבי אינה אומרת שהקיבוץ מסוכן. היא אומרת "אני לא יכולה לחזור לשם לבד" (גרין שאולוב, 2026). ההימנעות מהמקום עצמו היא הדרך שבה הגוף שומר על האדם.</w:t>
+        <w:t xml:space="preserve">ההבדל בין תושבים שחזרו לקיבוץ ובין אלה שאינם מסוגלים לחזור ממחיש את הטענה. זה אותו קיבוץ ואותו אירוע, אבל "אני לא מסוגל לחזור אחרי מה שעברתי" (גרין שאולוב, 2026, פס' 1) מתאר תגובה אישית, לא החלטה רציונלית. גם שורדת השבי אינה אומרת שהקיבוץ מסוכן. היא אומרת "אני לא יכולה לחזור לשם לבד" (גרין שאולוב, 2026, פס' 5). ההימנעות מהמקום עצמו היא הדרך שבה הגוף שומר על האדם.</w:t>
       </w:r>
     </w:p>
     <w:p>
@@ -505,7 +505,24 @@
           <w:szCs w:val="24"/>
           <w:rtl/>
         </w:rPr>
-        <w:t xml:space="preserve">קובלר-רוס (2002) תיארה חמישה שלבים בהתמודדות עם אובדן: הכחשה, כעס, מיקוח, דיכאון והשלמה. הסדר והעוצמה משתנים מאדם לאדם, ואובדן יכול להיות גם של בית, שגרה או תחושת ביטחון (זמיר נצראל, 2026א). הכעס בולט בכתבה ומופנה כלפי המדינה: "מינהלת התקומה מתעסקת בבטון ולא בשיקום התושבים". האובדן גם אינו רק של העבר. האם מתארת ילדים שהם דור שלישי בקיבוץ, שבתיהם נהרסו ובמקומם נבנים בתים שהם לא יגורו בהם (גרין שאולוב, 2026). השאלה של שורדת השבי, "איך אני בונה בית מחדש?", כבר מביטה קדימה ונוגעת בהשלמה, אבל בלי תשובה מעשית קשה להגיע אליה.</w:t>
+        <w:t xml:space="preserve">קובלר-רוס (2002) תיארה חמישה שלבים בהתמודדות עם אובדן: הכחשה, כעס, מיקוח, דיכאון והשלמה. הסדר והעוצמה משתנים מאדם לאדם, ואובדן יכול להיות גם של בית, שגרה או תחושת ביטחון (זמיר נצראל, 2026א).</w:t>
+      </w:r>
+    </w:p>
+    <w:p>
+      <w:pPr>
+        <w:bidi/>
+        <w:spacing w:after="120" w:line="360"/>
+        <w:ind w:firstLine="0"/>
+        <w:jc w:val="both"/>
+      </w:pPr>
+      <w:r>
+        <w:rPr>
+          <w:rFonts w:ascii="David" w:cs="David" w:eastAsia="David" w:hAnsi="David" w:hint="cs"/>
+          <w:sz w:val="24"/>
+          <w:szCs w:val="24"/>
+          <w:rtl/>
+        </w:rPr>
+        <w:t xml:space="preserve">בכתבה בולט הכעס, והוא מופנה כלפי המדינה: "מינהלת התקומה מתעסקת בבטון ולא בשיקום התושבים" (גרין שאולוב, 2026, פס' 3). האובדן גם אינו רק של העבר. האם מתארת ילדים שהם דור שלישי בקיבוץ, שבתיהם נהרסו ובמקומם נבנים בתים שהם לא יגורו בהם. השאלה של שורדת השבי, "איך אני בונה בית מחדש?" (גרין שאולוב, 2026, פס' 5), כבר מביטה קדימה ונוגעת בהשלמה, אבל בלי תשובה מעשית קשה להגיע אליה.</w:t>
       </w:r>
     </w:p>
     <w:p>
@@ -577,7 +594,7 @@
           <w:szCs w:val="24"/>
           <w:rtl/>
         </w:rPr>
-        <w:t xml:space="preserve">הרמן מסבירה היטב את הממד החברתי, ובמיוחד את הנזק שבהיעדר הכרה. עם זאת, המודל שלה מניח שאפשר לבסס קודם כול ביטחון, וכאן הביטחון הכלכלי תלוי בהחלטה של המדינה ולא בתהליך הטיפולי. ואן דר קולק מסביר את ההימנעות, אבל הכתבה אינה מתארת תסמינים גופניים, ולכן החלק הזה נשאר השערה. שלבי קובלר-רוס נקראים בקלות כרצף ליניארי, ואילו כאן האובדן עדיין נמשך, והכעס מתחדש בכל פעם שהבטחה אינה מתקיימת.</w:t>
+        <w:t xml:space="preserve">הרמן (1992/2001) מסבירה היטב את הממד החברתי, ובמיוחד את הנזק שבהיעדר הכרה. עם זאת, המודל שלה מניח שאפשר לבסס קודם כול ביטחון, וכאן הביטחון הכלכלי תלוי בהחלטה של המדינה ולא בתהליך הטיפולי. ואן דר קולק (2014/2021) מסביר את ההימנעות, אבל הכתבה אינה מתארת תסמינים גופניים, ולכן החלק הזה נשאר השערה. שלבי האבל של קובלר-רוס (2002) נקראים בקלות כרצף ליניארי, ואילו כאן האובדן עדיין נמשך, והכעס מתחדש בכל פעם שהבטחה אינה מתקיימת.</w:t>
       </w:r>
     </w:p>
     <w:p>

</xml_diff>

<commit_message>
Expand analysis and add summary with practical recommendations
Co-Authored-By: Claude Opus 5.5 <noreply@anthropic.com>
Claude-Session: https://claude.ai/code/session_01QD6xkALbogaTmX2V72X9od
</commit_message>
<xml_diff>
--- a/מטלת_אמצע_היבטים_פסיכולוגיים.docx
+++ b/מטלת_אמצע_היבטים_פסיכולוגיים.docx
@@ -421,6 +421,23 @@
     </w:p>
     <w:p>
       <w:pPr>
+        <w:bidi/>
+        <w:spacing w:after="120" w:line="360"/>
+        <w:ind w:firstLine="0"/>
+        <w:jc w:val="both"/>
+      </w:pPr>
+      <w:r>
+        <w:rPr>
+          <w:rFonts w:ascii="David" w:cs="David" w:eastAsia="David" w:hAnsi="David" w:hint="cs"/>
+          <w:sz w:val="24"/>
+          <w:szCs w:val="24"/>
+          <w:rtl/>
+        </w:rPr>
+        <w:t xml:space="preserve">גם השלבים המאוחרים במודל ניכרים בכתבה, אם כי באופן חלקי. ההגעה המשותפת לכנסת, לצד חברי כנסת שהתגייסו למאבק, היא צורה של קשר מחודש עם אחרים. התושבים אינם דורשים להעניש איש. הם מבקשים מנגנון שיטפל בכל מקרה לגופו, וזו ההגדרה של צדק כתיקון. אחד מחברי הכנסת בדיון תיאר את יחס המדינה כ"הפקרה ושכחה" (גרין שאולוב, 2026, פס' 6). כלומר, גם בעיני מי שנמצא מחוץ לקהילה, ההכרה שהרמן רואה בה תנאי להחלמה עדיין חסרה.</w:t>
+      </w:r>
+    </w:p>
+    <w:p>
+      <w:pPr>
         <w:pStyle w:val="Heading2"/>
         <w:bidi/>
         <w:spacing w:after="120" w:before="240" w:line="360"/>
@@ -474,6 +491,23 @@
     </w:p>
     <w:p>
       <w:pPr>
+        <w:bidi/>
+        <w:spacing w:after="120" w:line="360"/>
+        <w:ind w:firstLine="0"/>
+        <w:jc w:val="both"/>
+      </w:pPr>
+      <w:r>
+        <w:rPr>
+          <w:rFonts w:ascii="David" w:cs="David" w:eastAsia="David" w:hAnsi="David" w:hint="cs"/>
+          <w:sz w:val="24"/>
+          <w:szCs w:val="24"/>
+          <w:rtl/>
+        </w:rPr>
+        <w:t xml:space="preserve">ואן דר קולק מדגיש גם את מה שהאדם מביא איתו לאירוע. בכתבה מוזכרים תושבים בגיל מתקדם או במצב בריאותי שאינו מאפשר להם לחזור, וכאלה שנסיבות המשפחה שלהם השתנו (גרין שאולוב, 2026, פס' 2). לפי הגישה שלו, אצל אנשים שיסודות הביטחון שלהם נפגעו, חזרה למקום שהגוף מזהה כמסוכן אינה ריפוי. הריפוי מתחיל בהחזרת המגע עם הגוף ותחושת השליטה בו, באמצעות יוגה, מיינדפולנס או EMDR, ורק אחר כך אפשר לבחון אם חזרה אפשרית בכלל (זמיר נצראל, 2026ב).</w:t>
+      </w:r>
+    </w:p>
+    <w:p>
+      <w:pPr>
         <w:pStyle w:val="Heading2"/>
         <w:bidi/>
         <w:spacing w:after="120" w:before="240" w:line="360"/>
@@ -527,6 +561,23 @@
     </w:p>
     <w:p>
       <w:pPr>
+        <w:bidi/>
+        <w:spacing w:after="120" w:line="360"/>
+        <w:ind w:firstLine="0"/>
+        <w:jc w:val="both"/>
+      </w:pPr>
+      <w:r>
+        <w:rPr>
+          <w:rFonts w:ascii="David" w:cs="David" w:eastAsia="David" w:hAnsi="David" w:hint="cs"/>
+          <w:sz w:val="24"/>
+          <w:szCs w:val="24"/>
+          <w:rtl/>
+        </w:rPr>
+        <w:t xml:space="preserve">גם הדיכאון, השלב הרביעי, נשמע בכתבה, במשפט הקצר "אני לבד" (גרין שאולוב, 2026, פס' 5). בקורס הודגש שלקהילה תפקיד מרכזי בהתמודדות עם אובדן: לקבל, לתת זמן ולהקשיב שוב ושוב לאותו סיפור בלי לשפוט (זמיר נצראל, 2026א). המשפט "אף אחד לא שאל אותנו" מתאר בדיוק את היעדר ההקשבה הזו. הופמן, שהיגרה מפולין לקנדה ואיבדה את נופי ילדותה, מתארת הסתגלות הדרגתית שמתאפשרת רק כשנבנית קהילה חדשה (הופמן, 1989, כפי שמצוטט אצל זמיר נצראל, 2026א). מי שאינו חוזר לניר עוז צריך לבנות קהילה כזו במקום אחר, וכרגע אין לו כלים לעשות זאת.</w:t>
+      </w:r>
+    </w:p>
+    <w:p>
+      <w:pPr>
         <w:pStyle w:val="Heading2"/>
         <w:bidi/>
         <w:spacing w:after="120" w:before="240" w:line="360"/>
@@ -563,6 +614,23 @@
     </w:p>
     <w:p>
       <w:pPr>
+        <w:bidi/>
+        <w:spacing w:after="120" w:line="360"/>
+        <w:ind w:firstLine="0"/>
+        <w:jc w:val="both"/>
+      </w:pPr>
+      <w:r>
+        <w:rPr>
+          <w:rFonts w:ascii="David" w:cs="David" w:eastAsia="David" w:hAnsi="David" w:hint="cs"/>
+          <w:sz w:val="24"/>
+          <w:szCs w:val="24"/>
+          <w:rtl/>
+        </w:rPr>
+        <w:t xml:space="preserve">בחברה הישראלית טראומות עבר מתעוררות מחדש באירועים עכשוויים. בקורס הוצג כיצד אירועי 7 באוקטובר החיו את טראומת השואה (זמיר נצראל, 2026ג), ובכתבה עצמה ההשוואה שהתושבים עושים היא למפוני גוש קטיף. ההשוואה מלמדת שהם מחפשים מקום בתוך סיפור ישראלי מוכר של עקירה, סיפור שבו המדינה לקחה אחריות. לפי סול, ריפוי קולקטיבי דורש הכרה בטראומה של כל קבוצה (Saul, 2014, כפי שמצוטט אצל זמיר נצראל, 2026ג). לפי הובל, יוזמות שצומחות מתוך הקהילה עצמה מחזקות סולידריות ולכידות (זמיר נצראל, 2026ג). הדרישה של התושבים לייצג את עצמם היא יוזמה כזו, והמדינה, בינתיים, אינה נענית לה.</w:t>
+      </w:r>
+    </w:p>
+    <w:p>
+      <w:pPr>
         <w:pStyle w:val="Heading2"/>
         <w:bidi/>
         <w:spacing w:after="120" w:before="240" w:line="360"/>
@@ -595,6 +663,42 @@
           <w:rtl/>
         </w:rPr>
         <w:t xml:space="preserve">הרמן (1992/2001) מסבירה היטב את הממד החברתי, ובמיוחד את הנזק שבהיעדר הכרה. עם זאת, המודל שלה מניח שאפשר לבסס קודם כול ביטחון, וכאן הביטחון הכלכלי תלוי בהחלטה של המדינה ולא בתהליך הטיפולי. ואן דר קולק (2014/2021) מסביר את ההימנעות, אבל הכתבה אינה מתארת תסמינים גופניים, ולכן החלק הזה נשאר השערה. שלבי האבל של קובלר-רוס (2002) נקראים בקלות כרצף ליניארי, ואילו כאן האובדן עדיין נמשך, והכעס מתחדש בכל פעם שהבטחה אינה מתקיימת.</w:t>
+      </w:r>
+    </w:p>
+    <w:p>
+      <w:pPr>
+        <w:pStyle w:val="Heading2"/>
+        <w:bidi/>
+        <w:spacing w:after="120" w:before="240" w:line="360"/>
+        <w:jc w:val="right"/>
+      </w:pPr>
+      <w:r>
+        <w:rPr>
+          <w:rFonts w:ascii="David" w:cs="David" w:eastAsia="David" w:hAnsi="David" w:hint="cs"/>
+          <w:b/>
+          <w:bCs/>
+          <w:sz w:val="24"/>
+          <w:szCs w:val="24"/>
+          <w:rtl/>
+        </w:rPr>
+        <w:t xml:space="preserve">סיכום והמלצות</w:t>
+      </w:r>
+    </w:p>
+    <w:p>
+      <w:pPr>
+        <w:bidi/>
+        <w:spacing w:after="120" w:line="360"/>
+        <w:ind w:firstLine="0"/>
+        <w:jc w:val="both"/>
+      </w:pPr>
+      <w:r>
+        <w:rPr>
+          <w:rFonts w:ascii="David" w:cs="David" w:eastAsia="David" w:hAnsi="David" w:hint="cs"/>
+          <w:sz w:val="24"/>
+          <w:szCs w:val="24"/>
+          <w:rtl/>
+        </w:rPr>
+        <w:t xml:space="preserve">שלוש התאוריות מצביעות על אותה נקודה מכיוונים שונים: האובדן של תושבי ניר עוז שאינם חוזרים הוא אישי, גופני וחברתי בו-זמנית, והמכשול העיקרי להחלמה שלהם כרגע הוא היעדר הכרה. מכאן כמה המלצות מעשיות. ראשית, להקים את ועדת החריגים שהובטחה ב-2024 ולשלב בה נציגים של התושבים עצמם, כדי להחזיר להם שליטה. שנית, להציע מענה טיפולי רגשי וגופני שאינו מותנה בחזרה לקיבוץ. ולבסוף, במערכת החינוך: ילדים ממשפחות שאינן חוזרות צריכים לשמוע שגם הבחירה שלהם לגיטימית. צוותי חינוך שמכירים את תגובות הטראומה יכולים לקדם דיאלוג, כבוד הדדי ואמפתיה, כפי שהוצע בקורס (זמיר נצראל, 2026ג).</w:t>
       </w:r>
     </w:p>
     <w:p>

</xml_diff>

<commit_message>
Cite original sources instead of lecture slides
Co-Authored-By: Claude Opus 5.5 <noreply@anthropic.com>
Claude-Session: https://claude.ai/code/session_01QD6xkALbogaTmX2V72X9od
</commit_message>
<xml_diff>
--- a/מטלת_אמצע_היבטים_פסיכולוגיים.docx
+++ b/מטלת_אמצע_היבטים_פסיכולוגיים.docx
@@ -399,7 +399,7 @@
           <w:szCs w:val="24"/>
           <w:rtl/>
         </w:rPr>
-        <w:t xml:space="preserve">הרמן (1992/2001) רואה בטראומה תופעה חברתית ולא רק חוויה פרטית. האירוע מנפץ את תחושת הביטחון, האמון והאוטונומיה, וכשהסביבה אינה מכירה בפגיעה נוצרת פגיעה נוספת, שנלווים אליה בדידות ותחושת נטישה. ההחלמה מתחילה ביצירת ביטחון ושליטה, עוברת בזכירה ואבלות ובקשר מחודש עם אחרים, ומסתיימת בצדק שעניינו תיקון הנזק ולא ענישה (זמיר נצראל, 2026ג).</w:t>
+        <w:t xml:space="preserve">הרמן (1992/2001) רואה בטראומה תופעה חברתית ולא רק חוויה פרטית. האירוע מנפץ את תחושת הביטחון, האמון והאוטונומיה, וכשהסביבה אינה מכירה בפגיעה נוצרת פגיעה נוספת, שנלווים אליה בדידות ותחושת נטישה. ההחלמה מתחילה ביצירת ביטחון ושליטה, ועוברת בזכירה ואבלות ובקשר מחודש עם אחרים (הרמן, 1992/2001). בעבודתה המאוחרת הוסיפה הרמן את הצדק, שעניינו תיקון הנזק ולא ענישה (Herman, 2023).</w:t>
       </w:r>
     </w:p>
     <w:p>
@@ -469,7 +469,7 @@
           <w:szCs w:val="24"/>
           <w:rtl/>
         </w:rPr>
-        <w:t xml:space="preserve">לפי ואן דר קולק (2014/2021), הטראומה אינה האירוע עצמו אלא האופן שבו האדם חווה אותו ומפרש אותו. הפרשנות מושפעת מהאישיות, מניסיון קודם ומיסודות הביטחון, והגוף ממשיך לאותת על סכנה גם אחרי שהאירוע הסתיים. אחד הביטויים של פוסט טראומה הוא הימנעות (זמיר נצראל, 2026ב).</w:t>
+        <w:t xml:space="preserve">לפי ואן דר קולק (2014/2021), הטראומה אינה האירוע עצמו אלא האופן שבו האדם חווה אותו ומפרש אותו. הפרשנות מושפעת מהאישיות, מניסיון קודם ומיסודות הביטחון, והגוף ממשיך לאותת על סכנה גם אחרי שהאירוע הסתיים. אחד הביטויים של פוסט טראומה הוא הימנעות (ואן דר קולק, 2014/2021).</w:t>
       </w:r>
     </w:p>
     <w:p>
@@ -503,7 +503,7 @@
           <w:szCs w:val="24"/>
           <w:rtl/>
         </w:rPr>
-        <w:t xml:space="preserve">ואן דר קולק מדגיש גם את מה שהאדם מביא איתו לאירוע. בכתבה מוזכרים תושבים בגיל מתקדם או במצב בריאותי שאינו מאפשר להם לחזור, וכאלה שנסיבות המשפחה שלהם השתנו (גרין שאולוב, 2026, פס' 2). לפי הגישה שלו, אצל אנשים שיסודות הביטחון שלהם נפגעו, חזרה למקום שהגוף מזהה כמסוכן אינה ריפוי. הריפוי מתחיל בהחזרת המגע עם הגוף ותחושת השליטה בו, באמצעות יוגה, מיינדפולנס או EMDR, ורק אחר כך אפשר לבחון אם חזרה אפשרית בכלל (זמיר נצראל, 2026ב).</w:t>
+        <w:t xml:space="preserve">ואן דר קולק מדגיש גם את מה שהאדם מביא איתו לאירוע. בכתבה מוזכרים תושבים בגיל מתקדם או במצב בריאותי שאינו מאפשר להם לחזור, וכאלה שנסיבות המשפחה שלהם השתנו (גרין שאולוב, 2026, פס' 2). לפי הגישה שלו, אצל אנשים שיסודות הביטחון שלהם נפגעו, חזרה למקום שהגוף מזהה כמסוכן אינה ריפוי. הריפוי מתחיל בהחזרת המגע עם הגוף ותחושת השליטה בו, באמצעות יוגה, מיינדפולנס או EMDR, ורק אחר כך אפשר לבחון אם חזרה אפשרית בכלל (ואן דר קולק, 2014/2021).</w:t>
       </w:r>
     </w:p>
     <w:p>
@@ -539,7 +539,7 @@
           <w:szCs w:val="24"/>
           <w:rtl/>
         </w:rPr>
-        <w:t xml:space="preserve">קובלר-רוס (2002) תיארה חמישה שלבים בהתמודדות עם אובדן: הכחשה, כעס, מיקוח, דיכאון והשלמה. הסדר והעוצמה משתנים מאדם לאדם, ואובדן יכול להיות גם של בית, שגרה או תחושת ביטחון (זמיר נצראל, 2026א).</w:t>
+        <w:t xml:space="preserve">קובלר-רוס (2002) תיארה חמישה שלבים בהתמודדות עם אובדן: הכחשה, כעס, מיקוח, דיכאון והשלמה. הסדר והעוצמה משתנים מאדם לאדם, ואובדן יכול להיות גם של בית, שגרה או תחושת ביטחון.</w:t>
       </w:r>
     </w:p>
     <w:p>
@@ -573,7 +573,7 @@
           <w:szCs w:val="24"/>
           <w:rtl/>
         </w:rPr>
-        <w:t xml:space="preserve">גם הדיכאון, השלב הרביעי, נשמע בכתבה, במשפט הקצר "אני לבד" (גרין שאולוב, 2026, פס' 5). בקורס הודגש שלקהילה תפקיד מרכזי בהתמודדות עם אובדן: לקבל, לתת זמן ולהקשיב שוב ושוב לאותו סיפור בלי לשפוט (זמיר נצראל, 2026א). המשפט "אף אחד לא שאל אותנו" מתאר בדיוק את היעדר ההקשבה הזו. הופמן, שהיגרה מפולין לקנדה ואיבדה את נופי ילדותה, מתארת הסתגלות הדרגתית שמתאפשרת רק כשנבנית קהילה חדשה (הופמן, 1989, כפי שמצוטט אצל זמיר נצראל, 2026א). מי שאינו חוזר לניר עוז צריך לבנות קהילה כזו במקום אחר, וכרגע אין לו כלים לעשות זאת.</w:t>
+        <w:t xml:space="preserve">גם הדיכאון, השלב הרביעי, נשמע בכתבה, במשפט הקצר "אני לבד" (גרין שאולוב, 2026, פס' 5). לקהילה תפקיד מרכזי בהתמודדות: לתת זמן, להכיל ולהקשיב שוב ושוב לאותו סיפור בלי לשפוט, והמשפט "אף אחד לא שאל אותנו" מתאר בדיוק את היעדר ההקשבה הזו. הופמן (Hoffman, 1989), שהיגרה מפולין לקנדה ואיבדה את נופי ילדותה, מתארת הסתגלות הדרגתית שמתאפשרת רק כשנבנית קהילה חדשה. מי שאינו חוזר לניר עוז צריך לבנות קהילה כזו במקום אחר, וכרגע אין לו כלים לעשות זאת.</w:t>
       </w:r>
     </w:p>
     <w:p>
@@ -609,7 +609,7 @@
           <w:szCs w:val="24"/>
           <w:rtl/>
         </w:rPr>
-        <w:t xml:space="preserve">הקיבוץ הוא לא רק מקום מגורים אלא זהות קהילתית, ופגיעה בו היא אובדן של עולם ההנחות: ההנחה שאנחנו, כאנשים וכחברה, מוגנים (זמיר נצראל, 2026ב). טראומה קולקטיבית נצרבת בזיכרון הקבוצה (Saul, 2014, כפי שמצוטט אצל זמיר נצראל, 2026ג), וכמעט תמיד הופכת לבין-דורית (Hirschberger, 2018, כפי שמצוטט אצל זמיר נצראל, 2026ג). הנרטיב הציבורי של "חוזרים ובונים" מקשה במיוחד על מי שאינו מסוגל לחזור, וזו אולי הסיבה שחלק מהתושבים דורשים לדבר בשם עצמם ולא דרך הקיבוץ או המועצה.</w:t>
+        <w:t xml:space="preserve">הקיבוץ הוא לא רק מקום מגורים אלא זהות קהילתית, ופגיעה בו היא אובדן של עולם ההנחות: ההנחה שאנחנו, כאנשים וכחברה, מוגנים (Janoff-Bulman, 1992). טראומה קולקטיבית נצרבת בזיכרון הקבוצה (Saul, 2014), וכמעט תמיד הופכת לבין-דורית (Hirschberger, 2018). הנרטיב הציבורי של "חוזרים ובונים" מקשה במיוחד על מי שאינו מסוגל לחזור, וזו אולי הסיבה שחלק מהתושבים דורשים לדבר בשם עצמם ולא דרך הקיבוץ או המועצה.</w:t>
       </w:r>
     </w:p>
     <w:p>
@@ -626,7 +626,7 @@
           <w:szCs w:val="24"/>
           <w:rtl/>
         </w:rPr>
-        <w:t xml:space="preserve">בחברה הישראלית טראומות עבר מתעוררות מחדש באירועים עכשוויים. בקורס הוצג כיצד אירועי 7 באוקטובר החיו את טראומת השואה (זמיר נצראל, 2026ג), ובכתבה עצמה ההשוואה שהתושבים עושים היא למפוני גוש קטיף. ההשוואה מלמדת שהם מחפשים מקום בתוך סיפור ישראלי מוכר של עקירה, סיפור שבו המדינה לקחה אחריות. לפי סול, ריפוי קולקטיבי דורש הכרה בטראומה של כל קבוצה (Saul, 2014, כפי שמצוטט אצל זמיר נצראל, 2026ג). לפי הובל, יוזמות שצומחות מתוך הקהילה עצמה מחזקות סולידריות ולכידות (זמיר נצראל, 2026ג). הדרישה של התושבים לייצג את עצמם היא יוזמה כזו, והמדינה, בינתיים, אינה נענית לה.</w:t>
+        <w:t xml:space="preserve">בחברה הישראלית טראומות עבר מתעוררות מחדש באירועים עכשוויים. טריגרים עכשוויים מחיים את זיכרון הטראומה הקולקטיבית (Hirschberger, 2018), ואירועי 7 באוקטובר החיו אצל רבים את זיכרון השואה, ובכתבה עצמה ההשוואה שהתושבים עושים היא למפוני גוש קטיף. ההשוואה מלמדת שהם מחפשים מקום בתוך סיפור ישראלי מוכר של עקירה, סיפור שבו המדינה לקחה אחריות. לפי סול (Saul, 2014), ריפוי קולקטיבי דורש הכרה בטראומה של כל קבוצה. לפי הובל (Hübl, 2020), יוזמות שצומחות מתוך הקהילה עצמה מחזקות סולידריות ולכידות. הדרישה של התושבים לייצג את עצמם היא יוזמה כזו, והמדינה, בינתיים, אינה נענית לה.</w:t>
       </w:r>
     </w:p>
     <w:p>
@@ -698,7 +698,7 @@
           <w:szCs w:val="24"/>
           <w:rtl/>
         </w:rPr>
-        <w:t xml:space="preserve">שלוש התאוריות מצביעות על אותה נקודה מכיוונים שונים: האובדן של תושבי ניר עוז שאינם חוזרים הוא אישי, גופני וחברתי בו-זמנית, והמכשול העיקרי להחלמה שלהם כרגע הוא היעדר הכרה. מכאן כמה המלצות מעשיות. ראשית, להקים את ועדת החריגים שהובטחה ב-2024 ולשלב בה נציגים של התושבים עצמם, כדי להחזיר להם שליטה. שנית, להציע מענה טיפולי רגשי וגופני שאינו מותנה בחזרה לקיבוץ. ולבסוף, במערכת החינוך: ילדים ממשפחות שאינן חוזרות צריכים לשמוע שגם הבחירה שלהם לגיטימית. צוותי חינוך שמכירים את תגובות הטראומה יכולים לקדם דיאלוג, כבוד הדדי ואמפתיה, כפי שהוצע בקורס (זמיר נצראל, 2026ג).</w:t>
+        <w:t xml:space="preserve">שלוש התאוריות מצביעות על אותה נקודה מכיוונים שונים: האובדן של תושבי ניר עוז שאינם חוזרים הוא אישי, גופני וחברתי בו-זמנית, והמכשול העיקרי להחלמה שלהם כרגע הוא היעדר הכרה. מכאן כמה המלצות מעשיות. ראשית, להקים את ועדת החריגים שהובטחה ב-2024 ולשלב בה נציגים של התושבים עצמם, כדי להחזיר להם שליטה. שנית, להציע מענה טיפולי רגשי וגופני שאינו מותנה בחזרה לקיבוץ. ולבסוף, במערכת החינוך: ילדים ממשפחות שאינן חוזרות צריכים לשמוע שגם הבחירה שלהם לגיטימית. צוותי חינוך שמכירים את תגובות הטראומה יכולים לקדם דיאלוג, כבוד הדדי ואמפתיה, ולחזק את החוסן של הקהילה כולה (Saul, 2014).</w:t>
       </w:r>
     </w:p>
     <w:p>
@@ -849,7 +849,7 @@
           <w:szCs w:val="24"/>
           <w:rtl/>
         </w:rPr>
-        <w:t xml:space="preserve">זמיר נצראל, ל' (2026א). </w:t>
+        <w:t xml:space="preserve">קובלר-רוס, א' (2002). </w:t>
       </w:r>
       <w:r>
         <w:rPr>
@@ -860,127 +860,214 @@
           <w:szCs w:val="24"/>
           <w:rtl/>
         </w:rPr>
-        <w:t xml:space="preserve">אובדן ואבל</w:t>
-      </w:r>
-      <w:r>
-        <w:rPr>
-          <w:rFonts w:ascii="David" w:cs="David" w:eastAsia="David" w:hAnsi="David" w:hint="cs"/>
-          <w:sz w:val="24"/>
-          <w:szCs w:val="24"/>
-          <w:rtl/>
-        </w:rPr>
-        <w:t xml:space="preserve"> [מצגת הרצאה]. היבטים פסיכולוגיים בחינוך ובחברה, הקריה האקדמית אונו.</w:t>
-      </w:r>
-    </w:p>
-    <w:p>
-      <w:pPr>
-        <w:bidi/>
+        <w:t xml:space="preserve">המוות חשוב לחיים</w:t>
+      </w:r>
+      <w:r>
+        <w:rPr>
+          <w:rFonts w:ascii="David" w:cs="David" w:eastAsia="David" w:hAnsi="David" w:hint="cs"/>
+          <w:sz w:val="24"/>
+          <w:szCs w:val="24"/>
+          <w:rtl/>
+        </w:rPr>
+        <w:t xml:space="preserve">. כתר.</w:t>
+      </w:r>
+    </w:p>
+    <w:p>
+      <w:pPr>
         <w:spacing w:after="0" w:line="480"/>
-        <w:ind w:start="709" w:hanging="709"/>
-        <w:jc w:val="right"/>
-      </w:pPr>
-      <w:r>
-        <w:rPr>
-          <w:rFonts w:ascii="David" w:cs="David" w:eastAsia="David" w:hAnsi="David" w:hint="cs"/>
-          <w:sz w:val="24"/>
-          <w:szCs w:val="24"/>
-          <w:rtl/>
-        </w:rPr>
-        <w:t xml:space="preserve">זמיר נצראל, ל' (2026ב). </w:t>
-      </w:r>
-      <w:r>
-        <w:rPr>
-          <w:rFonts w:ascii="David" w:cs="David" w:eastAsia="David" w:hAnsi="David" w:hint="cs"/>
+        <w:ind w:left="709" w:hanging="709"/>
+        <w:jc w:val="left"/>
+      </w:pPr>
+      <w:r>
+        <w:rPr>
+          <w:rFonts w:ascii="Times New Roman" w:cs="Times New Roman" w:eastAsia="Times New Roman" w:hAnsi="Times New Roman"/>
+          <w:sz w:val="24"/>
+          <w:szCs w:val="24"/>
+        </w:rPr>
+        <w:t xml:space="preserve">Herman, J. L. (2023). </w:t>
+      </w:r>
+      <w:r>
+        <w:rPr>
+          <w:rFonts w:ascii="Times New Roman" w:cs="Times New Roman" w:eastAsia="Times New Roman" w:hAnsi="Times New Roman"/>
           <w:i/>
           <w:iCs/>
           <w:sz w:val="24"/>
           <w:szCs w:val="24"/>
-          <w:rtl/>
-        </w:rPr>
-        <w:t xml:space="preserve">טראומה</w:t>
-      </w:r>
-      <w:r>
-        <w:rPr>
-          <w:rFonts w:ascii="David" w:cs="David" w:eastAsia="David" w:hAnsi="David" w:hint="cs"/>
-          <w:sz w:val="24"/>
-          <w:szCs w:val="24"/>
-          <w:rtl/>
-        </w:rPr>
-        <w:t xml:space="preserve"> [מצגת הרצאה, יחידה 3]. היבטים פסיכולוגיים בחינוך ובחברה, הקריה האקדמית אונו.</w:t>
-      </w:r>
-    </w:p>
-    <w:p>
-      <w:pPr>
-        <w:bidi/>
+        </w:rPr>
+        <w:t xml:space="preserve">Truth and repair: How trauma survivors envision justice</w:t>
+      </w:r>
+      <w:r>
+        <w:rPr>
+          <w:rFonts w:ascii="Times New Roman" w:cs="Times New Roman" w:eastAsia="Times New Roman" w:hAnsi="Times New Roman"/>
+          <w:sz w:val="24"/>
+          <w:szCs w:val="24"/>
+        </w:rPr>
+        <w:t xml:space="preserve">. Basic Books.</w:t>
+      </w:r>
+    </w:p>
+    <w:p>
+      <w:pPr>
         <w:spacing w:after="0" w:line="480"/>
-        <w:ind w:start="709" w:hanging="709"/>
-        <w:jc w:val="right"/>
-      </w:pPr>
-      <w:r>
-        <w:rPr>
-          <w:rFonts w:ascii="David" w:cs="David" w:eastAsia="David" w:hAnsi="David" w:hint="cs"/>
-          <w:sz w:val="24"/>
-          <w:szCs w:val="24"/>
-          <w:rtl/>
-        </w:rPr>
-        <w:t xml:space="preserve">זמיר נצראל, ל' (2026ג). </w:t>
-      </w:r>
-      <w:r>
-        <w:rPr>
-          <w:rFonts w:ascii="David" w:cs="David" w:eastAsia="David" w:hAnsi="David" w:hint="cs"/>
+        <w:ind w:left="709" w:hanging="709"/>
+        <w:jc w:val="left"/>
+      </w:pPr>
+      <w:r>
+        <w:rPr>
+          <w:rFonts w:ascii="Times New Roman" w:cs="Times New Roman" w:eastAsia="Times New Roman" w:hAnsi="Times New Roman"/>
+          <w:sz w:val="24"/>
+          <w:szCs w:val="24"/>
+        </w:rPr>
+        <w:t xml:space="preserve">Hirschberger, G. (2018). Collective trauma and the social construction of meaning. </w:t>
+      </w:r>
+      <w:r>
+        <w:rPr>
+          <w:rFonts w:ascii="Times New Roman" w:cs="Times New Roman" w:eastAsia="Times New Roman" w:hAnsi="Times New Roman"/>
           <w:i/>
           <w:iCs/>
           <w:sz w:val="24"/>
           <w:szCs w:val="24"/>
-          <w:rtl/>
-        </w:rPr>
-        <w:t xml:space="preserve">טראומה: ההיבט החברתי-תרבותי של הטראומה</w:t>
-      </w:r>
-      <w:r>
-        <w:rPr>
-          <w:rFonts w:ascii="David" w:cs="David" w:eastAsia="David" w:hAnsi="David" w:hint="cs"/>
-          <w:sz w:val="24"/>
-          <w:szCs w:val="24"/>
-          <w:rtl/>
-        </w:rPr>
-        <w:t xml:space="preserve"> [מצגת הרצאה, יחידה 4]. היבטים פסיכולוגיים בחינוך ובחברה, הקריה האקדמית אונו.</w:t>
-      </w:r>
-    </w:p>
-    <w:p>
-      <w:pPr>
-        <w:bidi/>
+        </w:rPr>
+        <w:t xml:space="preserve">Frontiers in Psychology, 9</w:t>
+      </w:r>
+      <w:r>
+        <w:rPr>
+          <w:rFonts w:ascii="Times New Roman" w:cs="Times New Roman" w:eastAsia="Times New Roman" w:hAnsi="Times New Roman"/>
+          <w:sz w:val="24"/>
+          <w:szCs w:val="24"/>
+        </w:rPr>
+        <w:t xml:space="preserve">, Article 1441. https://doi.org/10.3389/fpsyg.2018.01441</w:t>
+      </w:r>
+    </w:p>
+    <w:p>
+      <w:pPr>
         <w:spacing w:after="0" w:line="480"/>
-        <w:ind w:start="709" w:hanging="709"/>
-        <w:jc w:val="right"/>
-      </w:pPr>
-      <w:r>
-        <w:rPr>
-          <w:rFonts w:ascii="David" w:cs="David" w:eastAsia="David" w:hAnsi="David" w:hint="cs"/>
-          <w:sz w:val="24"/>
-          <w:szCs w:val="24"/>
-          <w:rtl/>
-        </w:rPr>
-        <w:t xml:space="preserve">קובלר-רוס, א' (2002). </w:t>
-      </w:r>
-      <w:r>
-        <w:rPr>
-          <w:rFonts w:ascii="David" w:cs="David" w:eastAsia="David" w:hAnsi="David" w:hint="cs"/>
+        <w:ind w:left="709" w:hanging="709"/>
+        <w:jc w:val="left"/>
+      </w:pPr>
+      <w:r>
+        <w:rPr>
+          <w:rFonts w:ascii="Times New Roman" w:cs="Times New Roman" w:eastAsia="Times New Roman" w:hAnsi="Times New Roman"/>
+          <w:sz w:val="24"/>
+          <w:szCs w:val="24"/>
+        </w:rPr>
+        <w:t xml:space="preserve">Hoffman, E. (1989). </w:t>
+      </w:r>
+      <w:r>
+        <w:rPr>
+          <w:rFonts w:ascii="Times New Roman" w:cs="Times New Roman" w:eastAsia="Times New Roman" w:hAnsi="Times New Roman"/>
           <w:i/>
           <w:iCs/>
           <w:sz w:val="24"/>
           <w:szCs w:val="24"/>
-          <w:rtl/>
-        </w:rPr>
-        <w:t xml:space="preserve">המוות חשוב לחיים</w:t>
-      </w:r>
-      <w:r>
-        <w:rPr>
-          <w:rFonts w:ascii="David" w:cs="David" w:eastAsia="David" w:hAnsi="David" w:hint="cs"/>
-          <w:sz w:val="24"/>
-          <w:szCs w:val="24"/>
-          <w:rtl/>
-        </w:rPr>
-        <w:t xml:space="preserve">. כתר.</w:t>
+        </w:rPr>
+        <w:t xml:space="preserve">Lost in translation: A life in a new language</w:t>
+      </w:r>
+      <w:r>
+        <w:rPr>
+          <w:rFonts w:ascii="Times New Roman" w:cs="Times New Roman" w:eastAsia="Times New Roman" w:hAnsi="Times New Roman"/>
+          <w:sz w:val="24"/>
+          <w:szCs w:val="24"/>
+        </w:rPr>
+        <w:t xml:space="preserve">. E. P. Dutton.</w:t>
+      </w:r>
+    </w:p>
+    <w:p>
+      <w:pPr>
+        <w:spacing w:after="0" w:line="480"/>
+        <w:ind w:left="709" w:hanging="709"/>
+        <w:jc w:val="left"/>
+      </w:pPr>
+      <w:r>
+        <w:rPr>
+          <w:rFonts w:ascii="Times New Roman" w:cs="Times New Roman" w:eastAsia="Times New Roman" w:hAnsi="Times New Roman"/>
+          <w:sz w:val="24"/>
+          <w:szCs w:val="24"/>
+        </w:rPr>
+        <w:t xml:space="preserve">Hübl, T. (2020). </w:t>
+      </w:r>
+      <w:r>
+        <w:rPr>
+          <w:rFonts w:ascii="Times New Roman" w:cs="Times New Roman" w:eastAsia="Times New Roman" w:hAnsi="Times New Roman"/>
+          <w:i/>
+          <w:iCs/>
+          <w:sz w:val="24"/>
+          <w:szCs w:val="24"/>
+        </w:rPr>
+        <w:t xml:space="preserve">Healing collective trauma: A process for integrating our intergenerational and cultural wounds</w:t>
+      </w:r>
+      <w:r>
+        <w:rPr>
+          <w:rFonts w:ascii="Times New Roman" w:cs="Times New Roman" w:eastAsia="Times New Roman" w:hAnsi="Times New Roman"/>
+          <w:sz w:val="24"/>
+          <w:szCs w:val="24"/>
+        </w:rPr>
+        <w:t xml:space="preserve">. Sounds True.</w:t>
+      </w:r>
+    </w:p>
+    <w:p>
+      <w:pPr>
+        <w:spacing w:after="0" w:line="480"/>
+        <w:ind w:left="709" w:hanging="709"/>
+        <w:jc w:val="left"/>
+      </w:pPr>
+      <w:r>
+        <w:rPr>
+          <w:rFonts w:ascii="Times New Roman" w:cs="Times New Roman" w:eastAsia="Times New Roman" w:hAnsi="Times New Roman"/>
+          <w:sz w:val="24"/>
+          <w:szCs w:val="24"/>
+        </w:rPr>
+        <w:t xml:space="preserve">Janoff-Bulman, R. (1992). </w:t>
+      </w:r>
+      <w:r>
+        <w:rPr>
+          <w:rFonts w:ascii="Times New Roman" w:cs="Times New Roman" w:eastAsia="Times New Roman" w:hAnsi="Times New Roman"/>
+          <w:i/>
+          <w:iCs/>
+          <w:sz w:val="24"/>
+          <w:szCs w:val="24"/>
+        </w:rPr>
+        <w:t xml:space="preserve">Shattered assumptions: Towards a new psychology of trauma</w:t>
+      </w:r>
+      <w:r>
+        <w:rPr>
+          <w:rFonts w:ascii="Times New Roman" w:cs="Times New Roman" w:eastAsia="Times New Roman" w:hAnsi="Times New Roman"/>
+          <w:sz w:val="24"/>
+          <w:szCs w:val="24"/>
+        </w:rPr>
+        <w:t xml:space="preserve">. Free Press.</w:t>
+      </w:r>
+    </w:p>
+    <w:p>
+      <w:pPr>
+        <w:spacing w:after="0" w:line="480"/>
+        <w:ind w:left="709" w:hanging="709"/>
+        <w:jc w:val="left"/>
+      </w:pPr>
+      <w:r>
+        <w:rPr>
+          <w:rFonts w:ascii="Times New Roman" w:cs="Times New Roman" w:eastAsia="Times New Roman" w:hAnsi="Times New Roman"/>
+          <w:sz w:val="24"/>
+          <w:szCs w:val="24"/>
+        </w:rPr>
+        <w:t xml:space="preserve">Saul, J. (2014). </w:t>
+      </w:r>
+      <w:r>
+        <w:rPr>
+          <w:rFonts w:ascii="Times New Roman" w:cs="Times New Roman" w:eastAsia="Times New Roman" w:hAnsi="Times New Roman"/>
+          <w:i/>
+          <w:iCs/>
+          <w:sz w:val="24"/>
+          <w:szCs w:val="24"/>
+        </w:rPr>
+        <w:t xml:space="preserve">Collective trauma, collective healing: Promoting community resilience in the aftermath of disaster</w:t>
+      </w:r>
+      <w:r>
+        <w:rPr>
+          <w:rFonts w:ascii="Times New Roman" w:cs="Times New Roman" w:eastAsia="Times New Roman" w:hAnsi="Times New Roman"/>
+          <w:sz w:val="24"/>
+          <w:szCs w:val="24"/>
+        </w:rPr>
+        <w:t xml:space="preserve">. Routledge.</w:t>
       </w:r>
     </w:p>
     <w:sectPr>

</xml_diff>

<commit_message>
Cover page: single submitter, update date
Co-Authored-By: Claude Opus 5.5 <noreply@anthropic.com>
Claude-Session: https://claude.ai/code/session_01QD6xkALbogaTmX2V72X9od
</commit_message>
<xml_diff>
--- a/מטלת_אמצע_היבטים_פסיכולוגיים.docx
+++ b/מטלת_אמצע_היבטים_פסיכולוגיים.docx
@@ -205,34 +205,7 @@
           <w:szCs w:val="24"/>
           <w:rtl/>
         </w:rPr>
-        <w:t xml:space="preserve">מגישות:</w:t>
-      </w:r>
-    </w:p>
-    <w:p>
-      <w:pPr>
-        <w:bidi/>
-        <w:spacing w:after="120" w:line="360"/>
-        <w:jc w:val="center"/>
-      </w:pPr>
-      <w:r>
-        <w:rPr>
-          <w:rFonts w:ascii="David" w:cs="David" w:eastAsia="David" w:hAnsi="David" w:hint="cs"/>
-          <w:sz w:val="24"/>
-          <w:szCs w:val="24"/>
-          <w:rtl/>
-        </w:rPr>
-        <w:t xml:space="preserve">יסמין טהא, ת"ז </w:t>
-      </w:r>
-      <w:r>
-        <w:rPr>
-          <w:rFonts w:ascii="David" w:cs="David" w:eastAsia="David" w:hAnsi="David" w:hint="cs"/>
-          <w:sz w:val="24"/>
-          <w:szCs w:val="24"/>
-          <w:highlight w:val="yellow"/>
-          <w:highlightCs w:val="yellow"/>
-          <w:rtl/>
-        </w:rPr>
-        <w:t xml:space="preserve">[מספר]</w:t>
+        <w:t xml:space="preserve">מגישה:</w:t>
       </w:r>
     </w:p>
     <w:p>
@@ -246,31 +219,9 @@
           <w:rFonts w:ascii="David" w:cs="David" w:eastAsia="David" w:hAnsi="David" w:hint="cs"/>
           <w:sz w:val="24"/>
           <w:szCs w:val="24"/>
-          <w:highlight w:val="yellow"/>
-          <w:highlightCs w:val="yellow"/>
-          <w:rtl/>
-        </w:rPr>
-        <w:t xml:space="preserve">[שם מלא]</w:t>
-      </w:r>
-      <w:r>
-        <w:rPr>
-          <w:rFonts w:ascii="David" w:cs="David" w:eastAsia="David" w:hAnsi="David" w:hint="cs"/>
-          <w:sz w:val="24"/>
-          <w:szCs w:val="24"/>
-          <w:rtl/>
-        </w:rPr>
-        <w:t xml:space="preserve">, ת"ז </w:t>
-      </w:r>
-      <w:r>
-        <w:rPr>
-          <w:rFonts w:ascii="David" w:cs="David" w:eastAsia="David" w:hAnsi="David" w:hint="cs"/>
-          <w:sz w:val="24"/>
-          <w:szCs w:val="24"/>
-          <w:highlight w:val="yellow"/>
-          <w:highlightCs w:val="yellow"/>
-          <w:rtl/>
-        </w:rPr>
-        <w:t xml:space="preserve">[מספר]</w:t>
+          <w:rtl/>
+        </w:rPr>
+        <w:t xml:space="preserve">יסמין טהא</w:t>
       </w:r>
     </w:p>
     <w:p>
@@ -286,7 +237,7 @@
           <w:szCs w:val="24"/>
           <w:rtl/>
         </w:rPr>
-        <w:t xml:space="preserve">ט"ו בתשרי תשפ"ז | 26 בספטמבר 2026</w:t>
+        <w:t xml:space="preserve">כ"ו בתשרי תשפ"ז | 7 באוקטובר 2026</w:t>
       </w:r>
     </w:p>
     <w:p>

</xml_diff>